<commit_message>
DATN ho Ca Giay: bang on dinh sau sua chua - long song va suon doi, 12 truong hop
- on_dinh_suon_doi.py: bo 12 truong hop nhu Bang 5.2 (dong dat, mua, rut nuoc, thi cong 20 kPa),
  hien trang va sau sua chua (mat dinh +78,85); hinh OnDinh_SuonDoi_SauSC.png
- phan_tich_bo_sung.py chay lai theo thong so thong nhat (TH11 1,634; TH12 2,265)
- kt_cung_truot_sau_sc.py: kiem chung do tam truot (Nelder-Mead nhieu diem xuat phat)
- xuat_bang_on_dinh_docx.py -> TAI_VE/BangOnDinh_LongSong_SuonDoi.docx (Bang 5.3, 5.4)

Co-Authored-By: Claude Opus 5.5 <noreply@anthropic.com>
Claude-Session: https://claude.ai/code/session_01FZ7RkEfpZxiJWB6royQwfj
</commit_message>
<xml_diff>
--- a/DATN_HoCaGiay/TAI_VE/BangTham_LongSong_SuonDoi.docx
+++ b/DATN_HoCaGiay/TAI_VE/BangTham_LongSong_SuonDoi.docx
@@ -77,6 +77,7 @@
           </w:tcPr>
           <w:p>
             <w:pPr>
+              <w:keepNext/>
               <w:spacing w:before="20" w:after="20" w:line="240" w:lineRule="auto"/>
               <w:jc w:val="center"/>
             </w:pPr>
@@ -98,6 +99,7 @@
           </w:tcPr>
           <w:p>
             <w:pPr>
+              <w:keepNext/>
               <w:spacing w:before="20" w:after="20" w:line="240" w:lineRule="auto"/>
               <w:jc w:val="center"/>
             </w:pPr>
@@ -138,6 +140,7 @@
           </w:tcPr>
           <w:p>
             <w:pPr>
+              <w:keepNext/>
               <w:spacing w:before="20" w:after="20" w:line="240" w:lineRule="auto"/>
               <w:jc w:val="center"/>
             </w:pPr>
@@ -178,6 +181,7 @@
           </w:tcPr>
           <w:p>
             <w:pPr>
+              <w:keepNext/>
               <w:spacing w:before="20" w:after="20" w:line="240" w:lineRule="auto"/>
               <w:jc w:val="center"/>
             </w:pPr>
@@ -199,6 +203,7 @@
           </w:tcPr>
           <w:p>
             <w:pPr>
+              <w:keepNext/>
               <w:spacing w:before="20" w:after="20" w:line="240" w:lineRule="auto"/>
               <w:jc w:val="center"/>
             </w:pPr>
@@ -220,6 +225,7 @@
           </w:tcPr>
           <w:p>
             <w:pPr>
+              <w:keepNext/>
               <w:spacing w:before="20" w:after="20" w:line="240" w:lineRule="auto"/>
               <w:jc w:val="center"/>
             </w:pPr>
@@ -241,6 +247,7 @@
           </w:tcPr>
           <w:p>
             <w:pPr>
+              <w:keepNext/>
               <w:spacing w:before="20" w:after="20" w:line="240" w:lineRule="auto"/>
               <w:jc w:val="center"/>
             </w:pPr>
@@ -266,6 +273,7 @@
           </w:tcPr>
           <w:p>
             <w:pPr>
+              <w:keepNext/>
               <w:spacing w:before="20" w:after="20" w:line="240" w:lineRule="auto"/>
               <w:jc w:val="left"/>
             </w:pPr>
@@ -286,6 +294,7 @@
           </w:tcPr>
           <w:p>
             <w:pPr>
+              <w:keepNext/>
               <w:spacing w:before="20" w:after="20" w:line="240" w:lineRule="auto"/>
               <w:jc w:val="center"/>
             </w:pPr>
@@ -316,6 +325,7 @@
           </w:tcPr>
           <w:p>
             <w:pPr>
+              <w:keepNext/>
               <w:spacing w:before="20" w:after="20" w:line="240" w:lineRule="auto"/>
               <w:jc w:val="center"/>
             </w:pPr>
@@ -346,6 +356,7 @@
           </w:tcPr>
           <w:p>
             <w:pPr>
+              <w:keepNext/>
               <w:spacing w:before="20" w:after="20" w:line="240" w:lineRule="auto"/>
               <w:jc w:val="center"/>
             </w:pPr>
@@ -366,6 +377,7 @@
           </w:tcPr>
           <w:p>
             <w:pPr>
+              <w:keepNext/>
               <w:spacing w:before="20" w:after="20" w:line="240" w:lineRule="auto"/>
               <w:jc w:val="center"/>
             </w:pPr>
@@ -386,6 +398,7 @@
           </w:tcPr>
           <w:p>
             <w:pPr>
+              <w:keepNext/>
               <w:spacing w:before="20" w:after="20" w:line="240" w:lineRule="auto"/>
               <w:jc w:val="center"/>
             </w:pPr>
@@ -406,6 +419,7 @@
           </w:tcPr>
           <w:p>
             <w:pPr>
+              <w:keepNext/>
               <w:spacing w:before="20" w:after="20" w:line="240" w:lineRule="auto"/>
               <w:jc w:val="center"/>
             </w:pPr>
@@ -431,6 +445,7 @@
           </w:tcPr>
           <w:p>
             <w:pPr>
+              <w:keepNext/>
               <w:spacing w:before="20" w:after="20" w:line="240" w:lineRule="auto"/>
               <w:jc w:val="left"/>
             </w:pPr>
@@ -451,6 +466,7 @@
           </w:tcPr>
           <w:p>
             <w:pPr>
+              <w:keepNext/>
               <w:spacing w:before="20" w:after="20" w:line="240" w:lineRule="auto"/>
               <w:jc w:val="center"/>
             </w:pPr>
@@ -481,6 +497,7 @@
           </w:tcPr>
           <w:p>
             <w:pPr>
+              <w:keepNext/>
               <w:spacing w:before="20" w:after="20" w:line="240" w:lineRule="auto"/>
               <w:jc w:val="center"/>
             </w:pPr>
@@ -511,6 +528,7 @@
           </w:tcPr>
           <w:p>
             <w:pPr>
+              <w:keepNext/>
               <w:spacing w:before="20" w:after="20" w:line="240" w:lineRule="auto"/>
               <w:jc w:val="center"/>
             </w:pPr>
@@ -531,6 +549,7 @@
           </w:tcPr>
           <w:p>
             <w:pPr>
+              <w:keepNext/>
               <w:spacing w:before="20" w:after="20" w:line="240" w:lineRule="auto"/>
               <w:jc w:val="center"/>
             </w:pPr>
@@ -551,6 +570,7 @@
           </w:tcPr>
           <w:p>
             <w:pPr>
+              <w:keepNext/>
               <w:spacing w:before="20" w:after="20" w:line="240" w:lineRule="auto"/>
               <w:jc w:val="center"/>
             </w:pPr>
@@ -571,6 +591,7 @@
           </w:tcPr>
           <w:p>
             <w:pPr>
+              <w:keepNext/>
               <w:spacing w:before="20" w:after="20" w:line="240" w:lineRule="auto"/>
               <w:jc w:val="center"/>
             </w:pPr>
@@ -596,6 +617,7 @@
           </w:tcPr>
           <w:p>
             <w:pPr>
+              <w:keepNext/>
               <w:spacing w:before="20" w:after="20" w:line="240" w:lineRule="auto"/>
               <w:jc w:val="left"/>
             </w:pPr>
@@ -616,6 +638,7 @@
           </w:tcPr>
           <w:p>
             <w:pPr>
+              <w:keepNext/>
               <w:spacing w:before="20" w:after="20" w:line="240" w:lineRule="auto"/>
               <w:jc w:val="center"/>
             </w:pPr>
@@ -646,6 +669,7 @@
           </w:tcPr>
           <w:p>
             <w:pPr>
+              <w:keepNext/>
               <w:spacing w:before="20" w:after="20" w:line="240" w:lineRule="auto"/>
               <w:jc w:val="center"/>
             </w:pPr>
@@ -676,6 +700,7 @@
           </w:tcPr>
           <w:p>
             <w:pPr>
+              <w:keepNext/>
               <w:spacing w:before="20" w:after="20" w:line="240" w:lineRule="auto"/>
               <w:jc w:val="center"/>
             </w:pPr>
@@ -696,6 +721,7 @@
           </w:tcPr>
           <w:p>
             <w:pPr>
+              <w:keepNext/>
               <w:spacing w:before="20" w:after="20" w:line="240" w:lineRule="auto"/>
               <w:jc w:val="center"/>
             </w:pPr>
@@ -716,6 +742,7 @@
           </w:tcPr>
           <w:p>
             <w:pPr>
+              <w:keepNext/>
               <w:spacing w:before="20" w:after="20" w:line="240" w:lineRule="auto"/>
               <w:jc w:val="center"/>
             </w:pPr>
@@ -736,6 +763,7 @@
           </w:tcPr>
           <w:p>
             <w:pPr>
+              <w:keepNext/>
               <w:spacing w:before="20" w:after="20" w:line="240" w:lineRule="auto"/>
               <w:jc w:val="center"/>
             </w:pPr>
@@ -978,6 +1006,7 @@
           </w:tcPr>
           <w:p>
             <w:pPr>
+              <w:keepNext/>
               <w:spacing w:before="20" w:after="20" w:line="240" w:lineRule="auto"/>
               <w:jc w:val="center"/>
             </w:pPr>
@@ -999,6 +1028,7 @@
           </w:tcPr>
           <w:p>
             <w:pPr>
+              <w:keepNext/>
               <w:spacing w:before="20" w:after="20" w:line="240" w:lineRule="auto"/>
               <w:jc w:val="center"/>
             </w:pPr>
@@ -1039,6 +1069,7 @@
           </w:tcPr>
           <w:p>
             <w:pPr>
+              <w:keepNext/>
               <w:spacing w:before="20" w:after="20" w:line="240" w:lineRule="auto"/>
               <w:jc w:val="center"/>
             </w:pPr>
@@ -1079,6 +1110,7 @@
           </w:tcPr>
           <w:p>
             <w:pPr>
+              <w:keepNext/>
               <w:spacing w:before="20" w:after="20" w:line="240" w:lineRule="auto"/>
               <w:jc w:val="center"/>
             </w:pPr>
@@ -1100,6 +1132,7 @@
           </w:tcPr>
           <w:p>
             <w:pPr>
+              <w:keepNext/>
               <w:spacing w:before="20" w:after="20" w:line="240" w:lineRule="auto"/>
               <w:jc w:val="center"/>
             </w:pPr>
@@ -1121,6 +1154,7 @@
           </w:tcPr>
           <w:p>
             <w:pPr>
+              <w:keepNext/>
               <w:spacing w:before="20" w:after="20" w:line="240" w:lineRule="auto"/>
               <w:jc w:val="center"/>
             </w:pPr>
@@ -1142,6 +1176,7 @@
           </w:tcPr>
           <w:p>
             <w:pPr>
+              <w:keepNext/>
               <w:spacing w:before="20" w:after="20" w:line="240" w:lineRule="auto"/>
               <w:jc w:val="center"/>
             </w:pPr>
@@ -1167,6 +1202,7 @@
           </w:tcPr>
           <w:p>
             <w:pPr>
+              <w:keepNext/>
               <w:spacing w:before="20" w:after="20" w:line="240" w:lineRule="auto"/>
               <w:jc w:val="left"/>
             </w:pPr>
@@ -1187,6 +1223,7 @@
           </w:tcPr>
           <w:p>
             <w:pPr>
+              <w:keepNext/>
               <w:spacing w:before="20" w:after="20" w:line="240" w:lineRule="auto"/>
               <w:jc w:val="center"/>
             </w:pPr>
@@ -1217,6 +1254,7 @@
           </w:tcPr>
           <w:p>
             <w:pPr>
+              <w:keepNext/>
               <w:spacing w:before="20" w:after="20" w:line="240" w:lineRule="auto"/>
               <w:jc w:val="center"/>
             </w:pPr>
@@ -1247,6 +1285,7 @@
           </w:tcPr>
           <w:p>
             <w:pPr>
+              <w:keepNext/>
               <w:spacing w:before="20" w:after="20" w:line="240" w:lineRule="auto"/>
               <w:jc w:val="center"/>
             </w:pPr>
@@ -1267,6 +1306,7 @@
           </w:tcPr>
           <w:p>
             <w:pPr>
+              <w:keepNext/>
               <w:spacing w:before="20" w:after="20" w:line="240" w:lineRule="auto"/>
               <w:jc w:val="center"/>
             </w:pPr>
@@ -1287,6 +1327,7 @@
           </w:tcPr>
           <w:p>
             <w:pPr>
+              <w:keepNext/>
               <w:spacing w:before="20" w:after="20" w:line="240" w:lineRule="auto"/>
               <w:jc w:val="center"/>
             </w:pPr>
@@ -1307,6 +1348,7 @@
           </w:tcPr>
           <w:p>
             <w:pPr>
+              <w:keepNext/>
               <w:spacing w:before="20" w:after="20" w:line="240" w:lineRule="auto"/>
               <w:jc w:val="center"/>
             </w:pPr>
@@ -1332,6 +1374,7 @@
           </w:tcPr>
           <w:p>
             <w:pPr>
+              <w:keepNext/>
               <w:spacing w:before="20" w:after="20" w:line="240" w:lineRule="auto"/>
               <w:jc w:val="left"/>
             </w:pPr>
@@ -1352,6 +1395,7 @@
           </w:tcPr>
           <w:p>
             <w:pPr>
+              <w:keepNext/>
               <w:spacing w:before="20" w:after="20" w:line="240" w:lineRule="auto"/>
               <w:jc w:val="center"/>
             </w:pPr>
@@ -1382,6 +1426,7 @@
           </w:tcPr>
           <w:p>
             <w:pPr>
+              <w:keepNext/>
               <w:spacing w:before="20" w:after="20" w:line="240" w:lineRule="auto"/>
               <w:jc w:val="center"/>
             </w:pPr>
@@ -1412,6 +1457,7 @@
           </w:tcPr>
           <w:p>
             <w:pPr>
+              <w:keepNext/>
               <w:spacing w:before="20" w:after="20" w:line="240" w:lineRule="auto"/>
               <w:jc w:val="center"/>
             </w:pPr>
@@ -1432,6 +1478,7 @@
           </w:tcPr>
           <w:p>
             <w:pPr>
+              <w:keepNext/>
               <w:spacing w:before="20" w:after="20" w:line="240" w:lineRule="auto"/>
               <w:jc w:val="center"/>
             </w:pPr>
@@ -1452,6 +1499,7 @@
           </w:tcPr>
           <w:p>
             <w:pPr>
+              <w:keepNext/>
               <w:spacing w:before="20" w:after="20" w:line="240" w:lineRule="auto"/>
               <w:jc w:val="center"/>
             </w:pPr>
@@ -1472,6 +1520,7 @@
           </w:tcPr>
           <w:p>
             <w:pPr>
+              <w:keepNext/>
               <w:spacing w:before="20" w:after="20" w:line="240" w:lineRule="auto"/>
               <w:jc w:val="center"/>
             </w:pPr>
@@ -1497,6 +1546,7 @@
           </w:tcPr>
           <w:p>
             <w:pPr>
+              <w:keepNext/>
               <w:spacing w:before="20" w:after="20" w:line="240" w:lineRule="auto"/>
               <w:jc w:val="left"/>
             </w:pPr>
@@ -1517,6 +1567,7 @@
           </w:tcPr>
           <w:p>
             <w:pPr>
+              <w:keepNext/>
               <w:spacing w:before="20" w:after="20" w:line="240" w:lineRule="auto"/>
               <w:jc w:val="center"/>
             </w:pPr>
@@ -1547,6 +1598,7 @@
           </w:tcPr>
           <w:p>
             <w:pPr>
+              <w:keepNext/>
               <w:spacing w:before="20" w:after="20" w:line="240" w:lineRule="auto"/>
               <w:jc w:val="center"/>
             </w:pPr>
@@ -1577,6 +1629,7 @@
           </w:tcPr>
           <w:p>
             <w:pPr>
+              <w:keepNext/>
               <w:spacing w:before="20" w:after="20" w:line="240" w:lineRule="auto"/>
               <w:jc w:val="center"/>
             </w:pPr>
@@ -1597,6 +1650,7 @@
           </w:tcPr>
           <w:p>
             <w:pPr>
+              <w:keepNext/>
               <w:spacing w:before="20" w:after="20" w:line="240" w:lineRule="auto"/>
               <w:jc w:val="center"/>
             </w:pPr>
@@ -1617,6 +1671,7 @@
           </w:tcPr>
           <w:p>
             <w:pPr>
+              <w:keepNext/>
               <w:spacing w:before="20" w:after="20" w:line="240" w:lineRule="auto"/>
               <w:jc w:val="center"/>
             </w:pPr>
@@ -1637,6 +1692,7 @@
           </w:tcPr>
           <w:p>
             <w:pPr>
+              <w:keepNext/>
               <w:spacing w:before="20" w:after="20" w:line="240" w:lineRule="auto"/>
               <w:jc w:val="center"/>
             </w:pPr>

</xml_diff>